<commit_message>
chore: bump version 3.1.3 → 3.1.4; refresh docs & README
Version bumps:
- geoclaw_claude/__init__.py: __version__ = '3.1.4'
- setup.py: version = '3.1.4'

Docs (docs/):
- Add Technical Reference v3.1.4.docx/.pdf (replaces v3.1.3)
- Add User Guide v3.1.4.docx/.pdf (replaces v3.1.3)
- Add Beginner Guide v3.1.4.docx/.pdf (replaces v3.1.0)
- Remove old v3.1.3 and v3.1.0 docx/pdf files
- SKILL_WRITING_GUIDE.docx updated with v3.1.4 references

README:
- Version badge: 3.1.3 → 3.1.4
- Tests badge: 521 → 577/577
- Add v3.1.4 section: alive chat memory system, AI-first mode, gpt-5.x compat
- Update docs table to v3.1.4 links
- Update version history table
- Update project structure comments
- OpenAI moved to first in Provider table (now default)
</commit_message>
<xml_diff>
--- a/docs/SKILL_WRITING_GUIDE.docx
+++ b/docs/SKILL_WRITING_GUIDE.docx
@@ -227,7 +227,7 @@
           <w:sz w:val="22"/>
           <w:szCs w:val="22"/>
         </w:rPr>
-        <w:t xml:space="preserve">OpenClaw / AgentSkills export for ecosystem interoperability (v3.1.3)</w:t>
+        <w:t xml:space="preserve">OpenClaw / AgentSkills export for ecosystem interoperability (v3.1.4)</w:t>
       </w:r>
     </w:p>
     <w:p>
@@ -2150,7 +2150,7 @@
           <w:sz w:val="32"/>
           <w:szCs w:val="32"/>
         </w:rPr>
-        <w:t xml:space="preserve">5. OpenClaw / AgentSkills Compatibility (v3.1.3)</w:t>
+        <w:t xml:space="preserve">5. OpenClaw / AgentSkills Compatibility (v3.1.4)</w:t>
       </w:r>
     </w:p>
     <w:p>

</xml_diff>